<commit_message>
feat: agregar pruebas de rendimiento para Parabank
</commit_message>
<xml_diff>
--- a/entrega/Resumen_actividad_Parabank.docx
+++ b/entrega/Resumen_actividad_Parabank.docx
@@ -31,7 +31,7 @@
     </w:p>
     <w:p>
       <w:r>
-        <w:t>El equipo cuenta con un plan técnico para evaluar cinco servicios de ParaBank: inicio de sesión, transferencias, consulta de movimientos, solicitud de préstamo y pago de servicios. El plan define los perfiles de carga, los datos necesarios, la medición de tiempos y errores, la comprobación de transacciones y la ejecución prevista mediante GitHub Actions. La implementación de los scripts, las corridas y sus resultados quedan pendientes de registrar cuando el grupo disponga de la instancia aislada de prueba.</w:t>
+        <w:t>El equipo desplegó localmente la imagen oficial de ParaBank en un contenedor fijado por digest y accesible solo por loopback. Se ejecutaron smoke funcionales de las cinco historias contra su API OpenAPI 3.0.0: login 2/2, transferencias 50/50 a 5 solicitudes por segundo, movimientos 2/2, préstamo 1/1 y pagos 2/2. Las 50 transferencias se conciliaron con 100 movimientos y los 2 pagos con 2 débitos. Estas corridas validan contrato e integridad en bajo volumen; no demuestran los umbrales de carga alta.</w:t>
       </w:r>
     </w:p>
     <w:p>
@@ -276,17 +276,17 @@
     </w:p>
     <w:p>
       <w:r>
-        <w:t>Ejecución de GitHub Actions: [PEGAR ENLACE O IDENTIFICADOR]</w:t>
+        <w:t>Ejecución local de Gatling: smoke funcional, 24 de septiembre de 2026; la instancia permanece disponible en http://127.0.0.1:8080.</w:t>
       </w:r>
     </w:p>
     <w:p>
       <w:r>
-        <w:t>Reportes y verificación de transacciones: [PEGAR UBICACIÓN]</w:t>
+        <w:t>Reportes HTML: target/gatling/ (excluido de Git). Métricas y conciliación smoke: evidence/local-smoke-summary.md. Se conciliaron transferencias y pagos; las campañas de alta concurrencia siguen pendientes.</w:t>
       </w:r>
     </w:p>
     <w:p>
       <w:r>
-        <w:t>Estado de los criterios de aceptación: [COMPLETAR DESPUÉS DE EJECUTAR]</w:t>
+        <w:t>Estado de los criterios de aceptación: sin veredicto para carga alta; los smoke checks no alcanzaron la concurrencia o tasa de transferencia requerida.</w:t>
       </w:r>
     </w:p>
     <w:p>

</xml_diff>